<commit_message>
docs: bridge report round number follows the handshake (round 20), regenerate docx/pptx + manifest
Co-authored-by: arena-agent <297053741+arena-agent@users.noreply.github.com>
</commit_message>
<xml_diff>
--- a/deliverable/BRIDGE_01a0aa00_v2.8.1.docx
+++ b/deliverable/BRIDGE_01a0aa00_v2.8.1.docx
@@ -699,7 +699,7 @@
         <w:pStyle w:val="ListBullet"/>
       </w:pPr>
       <w:r>
-        <w:t>本轮（round 1）状态：awaiting_check / pending —— 等这台机器的值守回传。在本机粘完第 2 节并跑完 bootstrap 之后，最多一个轮询间隔（默认 2 分钟）就会自动判定。</w:t>
+        <w:t>本轮（round 20）状态：awaiting_check / pending —— 等这台机器的值守回传。在本机粘完第 2 节并跑完 bootstrap 之后，最多一个轮询间隔（默认 2 分钟）就会自动判定。</w:t>
       </w:r>
     </w:p>
     <w:p>
@@ -825,7 +825,7 @@
     <w:p/>
     <w:p>
       <w:r>
-        <w:t>round 1 = 这一轮（awaiting_check / pending）  |  markers: 2.8.1 , git-sync , local_check.ps1 , round 1 , LAPTOP-R77M5D6M , arena/01a0aa00-git-pull-arena</w:t>
+        <w:t>round 20 = 这一轮（awaiting_check / pending）  |  markers: 2.8.1 , git-sync , local_check.ps1 , round 20 , LAPTOP-R77M5D6M , arena/01a0aa00-git-pull-arena</w:t>
       </w:r>
     </w:p>
     <w:sectPr>

</xml_diff>

<commit_message>
feat: round 21 - user guide docx/pptx (install / daily commands / watcher / troubleshooting) + refreshed bridge report + manifest
Co-authored-by: arena-agent <297053741+arena-agent@users.noreply.github.com>
</commit_message>
<xml_diff>
--- a/deliverable/BRIDGE_01a0aa00_v2.8.1.docx
+++ b/deliverable/BRIDGE_01a0aa00_v2.8.1.docx
@@ -13,6 +13,11 @@
     <w:p>
       <w:r>
         <w:t>session 01a0aa00  |  git-sync v2.8.1  |  branch arena/01a0aa00-git-pull-arena  |  generated by code/make_bridge_report.py</w:t>
+      </w:r>
+    </w:p>
+    <w:p>
+      <w:r>
+        <w:t>本会话另外交付了一份《使用说明》：deliverable/GUIDE_01a0aa00_v2.8.1.docx 与同内容的 幻灯片 GUIDE_01a0aa00_v2.8.1.pptx（安装 / 日常命令 / 值守 / 故障 / 边界，逐条可照抄）。</w:t>
       </w:r>
     </w:p>
     <w:p>
@@ -699,7 +704,7 @@
         <w:pStyle w:val="ListBullet"/>
       </w:pPr>
       <w:r>
-        <w:t>本轮（round 20）状态：awaiting_check / pending —— 等这台机器的值守回传。在本机粘完第 2 节并跑完 bootstrap 之后，最多一个轮询间隔（默认 2 分钟）就会自动判定。</w:t>
+        <w:t>本轮的读写：agent-check.sh --request 把 handshake 写成 awaiting_check / pending，值守回传后变成 passed / failed 并 push 回分支；当前值永远看 results/status/handshake.json。</w:t>
       </w:r>
     </w:p>
     <w:p>
@@ -825,7 +830,7 @@
     <w:p/>
     <w:p>
       <w:r>
-        <w:t>round 20 = 这一轮（awaiting_check / pending）  |  markers: 2.8.1 , git-sync , local_check.ps1 , round 20 , LAPTOP-R77M5D6M , arena/01a0aa00-git-pull-arena</w:t>
+        <w:t>markers: 2.8.1 , git-sync , local_check.ps1 , LAPTOP-R77M5D6M , arena/01a0aa00-git-pull-arena</w:t>
       </w:r>
     </w:p>
     <w:sectPr>

</xml_diff>